<commit_message>
Group 07: revised business model, frontend and updated dossier (#8)
Merges revised business model with conditional partial cleanup, updated dashboard/reports, and signed dossier for Group 07 (Soumil, Aditya, Priyansh).
</commit_message>
<xml_diff>
--- a/Group_07_Soumil_Aditya_Priyansh/docs/MDRIIA_Group_07_Technical_Dossier.docx
+++ b/Group_07_Soumil_Aditya_Priyansh/docs/MDRIIA_Group_07_Technical_Dossier.docx
@@ -2185,7 +2185,7 @@
                     <w:sz w:val="15"/>
                     <w:szCs w:val="15"/>
                   </w:rPr>
-                  <w:t>Ward scenario: 7.5 rooms/day; manual active staff time and elapsed time each 15.2 min/room (=5.2 clutter+10 residual). All are assumptions; real hospital baseline remains unmeasured.</w:t>
+                  <w:t>Conditional deployment: 15 rooms/day over 12 hours; manual staff and elapsed time 15.2 min/room (5.2 clutter+10 residual), all assumed. Fixed normalization retains 7.5 rooms/day and 693.5 staff-h/year. No measured hospital baseline.</w:t>
                 </w:r>
               </w:sdtContent>
             </w:sdt>
@@ -3548,7 +3548,7 @@
                     <w:sz w:val="14"/>
                     <w:szCs w:val="14"/>
                   </w:rPr>
-                  <w:t>AI-assisted input/source register and five-mode FMEA, replacing unsupported legacy economics. Workflow/cost values remain assumptions; risk ratings remain proposed judgments. Assigned review: Soumil.</w:t>
+                  <w:t>AI-assisted input/source register and FMEA. Adds a conditional partial-human-cleanup deployment and retains the original conservative case. Human effort, demand, inspection, costs and avoided spending remain assumptions. Assigned review: Soumil.</w:t>
                 </w:r>
               </w:sdtContent>
             </w:sdt>
@@ -3820,7 +3820,7 @@
                     <w:sz w:val="14"/>
                     <w:szCs w:val="14"/>
                   </w:rPr>
-                  <w:t>AI-assisted labour/cash accounting, payback, queue stability, sensitivity and dashboard. Nine business tests pass; default cash payback is not finite. Assigned business review: Soumil.</w:t>
+                  <w:t>AI-assisted labour/cash, payback, queue, sensitivity and dashboard. New partial-cleanup case: 44.54-month conditional payback; original no-payback case retained. Fifteen accounting/provenance checks pass. Assigned business review: Soumil.</w:t>
                 </w:r>
               </w:sdtContent>
             </w:sdt>
@@ -4174,7 +4174,7 @@
                 <w:sz w:val="14"/>
                 <w:szCs w:val="14"/>
               </w:rPr>
-              <w:t>Corrected business scope: ward scenario of 7.5 rooms/day. Quantify staff capacity, elapsed room readiness and cash cost separately. Original 15→7 min, 4 h/day and 35-minute acceleration claims are unsupported and excluded. Section 3.1 uses final simulated performance with unvalidated economic assumptions; these are not measured hospital savings.</w:t>
+              <w:t>Business revision 30-Oct-2026: conditional partial cleanup, 15 rooms/day, 12-hour dispatch, .5 min inspection and f=1 assumed avoided spending. Not observed hospital savings; readiness remains slower. The unchanged showcase video describes the original no-payback case. This later scenario will be explained in the live demo/viva.</w:t>
             </w:r>
           </w:p>
         </w:tc>
@@ -4414,7 +4414,7 @@
               <w:rPr>
                 <w:sz w:val="13"/>
               </w:rPr>
-              <w:t>H = housekeeping staff-hours per day freed from clutter clearing (staff-hours/day)</w:t>
+              <w:t>H = D(L_manual − L_assisted)/60. Partial cleanup assumes human effort follows remaining object count; inspection and residual cleaning are added. Hours released are not automatically cash savings.</w:t>
             </w:r>
           </w:p>
         </w:tc>
@@ -4443,7 +4443,7 @@
                     <w:sz w:val="14"/>
                     <w:szCs w:val="14"/>
                   </w:rPr>
-                  <w:t>FINAL SIMULATION + assumptions: 50 proposed trials; success p=0.560, actual mean attempt T=14.1998 min (includes unsuccessful attempts). Assumed D=7.5 rooms/day, setup h=1 staff-min, attendance a=.05, manual clutter=5.2 and residual=10 staff-min. Assisted Lr=h+aT+(1−p)5.2+10. No clinical benefit inferred.</w:t>
+                  <w:t>CONDITIONAL partial cleanup. Audited: 50 proposed trials, p=0.56 full-room success, T=14.1998 min/attempt; 137/800 objects unresolved. Assume equal manual effort per item: Lr=1+.05T+.17125×5.2+10+.5 inspection; D=15 rooms/day.</w:t>
                 </w:r>
               </w:sdtContent>
             </w:sdt>
@@ -4474,7 +4474,7 @@
                     <w:sz w:val="14"/>
                     <w:szCs w:val="14"/>
                   </w:rPr>
-                  <w:t>H=D(Lm−Lr)/60=0.15025 staff-h/day; active staff 15.20→14.00 min/room. Elapsed readiness 15.20→27.49 min; staff time is not elapsed time or cash savings.</w:t>
+                  <w:t>H=15(15.2−13.10049)/60=0.524877 staff-h/day (31.49 staff-min). Staff 15.20→13.10 min/room; elapsed readiness 15.20→26.59 min. Inspection, reusable placements and staffing are assumptions; no faster bed-turnover claim.</w:t>
                 </w:r>
               </w:sdtContent>
             </w:sdt>
@@ -4545,7 +4545,7 @@
                     <w:sz w:val="14"/>
                     <w:szCs w:val="14"/>
                   </w:rPr>
-                  <w:t>Assumptions: K=.58 reference annual labour-cost units, maintenance=.08/yr, energy=.02/yr, life=5 yr, realization f=0. Fixed reference=693.5 productive staff-h/year. If annual cash saving ΔC&gt;0: months=12K/ΔC; P=K/(5ΔC). Otherwise no finite payback. Inputs/source register in analytics/business_inputs.json.</w:t>
+                  <w:t>Assumed K=.58 reference annual labour-cost units, maintenance=.08/yr, variable energy=.04/yr at 15 rooms/day; life=5 yr. f=1 assumes all released labour value reduces actual spending. Fixed reference=693.5 staff-h/year; no supplier/field validation.</w:t>
                 </w:r>
               </w:sdtContent>
             </w:sdt>
@@ -4576,7 +4576,7 @@
                     <w:sz w:val="14"/>
                     <w:szCs w:val="14"/>
                   </w:rPr>
-                  <w:t>No finite cash payback, months or P; annual cash saving -0.10000 reference units/year. Simple undiscounted model; no validated procurement cost.</w:t>
+                  <w:t>CONDITIONAL simple payback=44.54 months (3.712 yr); P=0.7424. Annual cash saving=0.156251 reference units/year. Requires genuinely avoided expenditure; not measured profit. At f=.75 payback=79.83 months, beyond five-year life.</w:t>
                 </w:r>
               </w:sdtContent>
             </w:sdt>
@@ -4649,7 +4649,7 @@
                     <w:sz w:val="14"/>
                     <w:szCs w:val="14"/>
                   </w:rPr>
-                  <w:t>Cb=baseline annual staff value/reference labour; Cr=Cb−f·max(B,0)+max(−B,0)+maintenance+energy, where B is released annual labour value. κ=Cr/Cb; cash NCRI=1−κ and may be negative. Reallocation alone does not reduce payroll; economic inputs remain assumptions.</w:t>
+                  <w:t>Cb=2 reference units/year at assumed 15 rooms/day; released labour value B=.276251. Cr=Cb−f·max(B,0)+max(−B,0)+.08+.04. Cash NCRI=1−Cr/Cb. Partial credit and full spending realization are scenario assumptions, not simulation findings.</w:t>
                 </w:r>
               </w:sdtContent>
             </w:sdt>
@@ -4680,7 +4680,7 @@
                     <w:sz w:val="14"/>
                     <w:szCs w:val="14"/>
                   </w:rPr>
-                  <w:t>Cash κ=1.10000; NCRI=-0.10000. Resource-value NCRI=-0.02092 is opportunity value, not a cash reduction.</w:t>
+                  <w:t>Conditional cash κ=.921874; NCRI=.078126 (7.81%). Resource-value NCRI=.078126 only equals cash here because f=1 is assumed. Original conservative 7.5-room/f=0/full-redo case remains NCRI=−.10, no payback.</w:t>
                 </w:r>
               </w:sdtContent>
             </w:sdt>
@@ -4751,7 +4751,7 @@
                     <w:sz w:val="14"/>
                     <w:szCs w:val="14"/>
                   </w:rPr>
-                  <w:t>Assumed Poisson arrivals, exponential service, FCFS, one paired robot/staff cell, serial service. λ=7.5/8=.9375 rooms/h; μ=60/elapsed service min. Wq=ρ/(μ−λ) for ρ&lt;1; not a fitted hospital queue. MIT Larson/Odoni §4.6.2 (source register).</w:t>
+                  <w:t>Illustrative M/M/1: assumed 15 arrivals over 12 h, λ=1.25/h; one serial robot/staff cell, Poisson arrivals and exponential service. Inspection=.5 elapsed min/room. Transfer, charging and peak demand require validation; not a fitted hospital queue.</w:t>
                 </w:r>
               </w:sdtContent>
             </w:sdt>
@@ -4782,7 +4782,7 @@
                     <w:sz w:val="14"/>
                     <w:szCs w:val="14"/>
                   </w:rPr>
-                  <w:t>Manual μ=3.9474/h,ρ=0.2375,Wq=4.7344 min; robot μ=2.1828/h,ρ=0.4295,Wq=20.694 min.</w:t>
+                  <w:t>Manual μ=3.9474/h,ρ=.3167,Wq=7.044 min; assisted μ=2.2565/h,ρ=.5540,Wq=33.025 min. Both stable in this assumed queue; assisted waiting and room readiness are worse, so no faster-turnover benefit is claimed.</w:t>
                 </w:r>
               </w:sdtContent>
             </w:sdt>
@@ -4844,7 +4844,7 @@
                     <w:sz w:val="14"/>
                     <w:szCs w:val="14"/>
                   </w:rPr>
-                  <w:t>One input at a time ±30% within bounds; realization and attendance span [0,1], paired cells 1/2. Fixed normalization anchor. Final simulated timing/success are held fixed in business scenarios; all operational/economic inputs are labelled assumptions. See business_final/sensitivity.csv and graphs.</w:t>
+                  <w:t>Cash realization varies 0–100%; attendance/inputs vary ±30% within bounds. Partial cleanup credits equal human effort per remaining object; inspect=.5 min/room, both unvalidated. Original case: analytics/business_inputs_conservative.json; reports: docs/business_conservative/.</w:t>
                 </w:r>
               </w:sdtContent>
             </w:sdt>
@@ -4872,7 +4872,7 @@
                     <w:sz w:val="14"/>
                     <w:szCs w:val="14"/>
                   </w:rPr>
-                  <w:t>Cash operating break-even realization: 126.45%; within-life threshold: 273.14% (infeasible if &gt;100%). Staff-time release attendance threshold: 13.46%. Proposed FMEA scores still require team review.</w:t>
+                  <w:t>Operating break-even cash realization=43.44%; within-life threshold=85.43%. At 75% realization, payback=79.83 months; at 0%, no payback. Staff release requires attendance&lt;19.79%. FMEA judgments remain proposed and require review.</w:t>
                 </w:r>
               </w:sdtContent>
             </w:sdt>
@@ -5005,7 +5005,7 @@
                     <w:sz w:val="15"/>
                     <w:szCs w:val="15"/>
                   </w:rPr>
-                  <w:t>λ=.9375 rooms/h;c=1;μ_manual=3.94737/h,μ_robot=2.18279/h. Simulated robot performance plus assumed workflow; not observed hospital arrivals.</w:t>
+                  <w:t>λ=1.25 rooms/h;c=1;μ_manual=3.94737/h,μ_assisted=2.25646/h. Assumed 12-hour dispatch; robot full-room success remains 28/50. Partial human-work credit is not a revised robot success rate.</w:t>
                 </w:r>
               </w:sdtContent>
             </w:sdt>
@@ -5060,7 +5060,7 @@
                     <w:sz w:val="15"/>
                     <w:szCs w:val="15"/>
                   </w:rPr>
-                  <w:t>No finite cash payback, months or P; final simulated performance with unvalidated economic assumptions.</w:t>
+                  <w:t>44.54 months; P=.7424 under conditional full cash realization. No measured hospital financial return is asserted. With no avoided spending, no finite payback.</w:t>
                 </w:r>
               </w:sdtContent>
             </w:sdt>
@@ -6957,7 +6957,7 @@
               <w:jc w:val="center"/>
             </w:pPr>
             <w:r>
-              <w:t xml:space="preserve">Final simulation + assumed economics: cash payback/NCRI sensitivity. </w:t>
+              <w:t xml:space="preserve">Conditional partial cleanup: cash payback sensitivity; f=1 assumes genuinely avoided spending.</w:t>
             </w:r>
             <w:r>
               <w:br/>
@@ -7014,7 +7014,7 @@
               <w:jc w:val="center"/>
             </w:pPr>
             <w:r>
-              <w:t xml:space="preserve">Final simulation + assumed workflow: labour and elapsed time differ. </w:t>
+              <w:t xml:space="preserve">Conditional workflow: staff time improves; elapsed room readiness remains slower.</w:t>
             </w:r>
             <w:r>
               <w:br/>
@@ -9136,7 +9136,7 @@
                     <w:sz w:val="13"/>
                     <w:szCs w:val="13"/>
                   </w:rPr>
-                  <w:t>Replacement upload pending (previous post deleted)</w:t>
+                  <w:t>https://lnkd.in/p/diSXTY-2</w:t>
                 </w:r>
               </w:sdtContent>
             </w:sdt>
@@ -9192,7 +9192,7 @@
                     <w:sz w:val="13"/>
                     <w:szCs w:val="13"/>
                   </w:rPr>
-                  <w:t>03:23.73 (203.73 seconds; corrected local export)</w:t>
+                  <w:t>03:23.73 (203.73 seconds; supplied corrected export; original conservative business case)</w:t>
                 </w:r>
               </w:sdtContent>
             </w:sdt>
@@ -10181,7 +10181,7 @@
                     <w:sz w:val="14"/>
                     <w:szCs w:val="14"/>
                   </w:rPr>
-                  <w:t>Reallocation does not itself cut spending. At f=0, default cash NCRI=−.10 with no finite payback. UK Government Efficiency Framework §§4.1–4.5 distinguishes benefits: gov.uk/government/publications/the-government-efficiency-framework/the-government-efficiency-framework--2.</w:t>
+                  <w:t>Reallocation alone does not reduce spending. Original f=0 case: NCRI=−.10, no payback. Revised f=1 partial-cleanup scenario: conditional 44.54-month payback, not proven savings. UK Government Efficiency Framework §§4.1–4.5 distinguishes cash from capacity benefits.</w:t>
                 </w:r>
               </w:sdtContent>
             </w:sdt>
@@ -10927,7 +10927,7 @@
                     <w:sz w:val="14"/>
                     <w:szCs w:val="14"/>
                   </w:rPr>
-                  <w:t>Group 01 video unavailable; timestamp not assessed.</w:t>
+                  <w:t>01:15</w:t>
                 </w:r>
               </w:sdtContent>
             </w:sdt>

</xml_diff>